<commit_message>
Guide: copy-paste clone commands for the starter repository
</commit_message>
<xml_diff>
--- a/docs/Heart_App_Setup_Guide.docx
+++ b/docs/Heart_App_Setup_Guide.docx
@@ -804,16 +804,13 @@
     </w:p>
     <w:p>
       <w:r>
-        <w:t xml:space="preserve">You need </w:t>
+        <w:t xml:space="preserve">Starter repository: </w:t>
       </w:r>
       <w:r>
         <w:rPr>
           <w:b/>
         </w:rPr>
-        <w:t>your own copy</w:t>
-      </w:r>
-      <w:r>
-        <w:t xml:space="preserve"> of the repository so that you can push changes and connect it to your own Azure account.</w:t>
+        <w:t>https://github.com/Abhi1727/heart-disease-azure-starter</w:t>
       </w:r>
     </w:p>
     <w:p>
@@ -821,86 +818,30 @@
         <w:rPr>
           <w:b/>
         </w:rPr>
-        <w:t>Option A — Use the template (recommended)</w:t>
-      </w:r>
-    </w:p>
-    <w:p>
-      <w:pPr>
-        <w:ind w:left="360" w:hanging="280"/>
-      </w:pPr>
-      <w:r>
-        <w:t xml:space="preserve">1. Open the starter repository link you were given and click </w:t>
-      </w:r>
-      <w:r>
-        <w:rPr>
-          <w:b/>
-        </w:rPr>
-        <w:t>Use this template → Create a new repository</w:t>
-      </w:r>
-      <w:r>
-        <w:t>.</w:t>
-      </w:r>
-    </w:p>
-    <w:p>
-      <w:pPr>
-        <w:ind w:left="360" w:hanging="280"/>
-      </w:pPr>
-      <w:r>
-        <w:t xml:space="preserve">2. Choose your account as the owner, give it a name (e.g. </w:t>
+        <w:t>1. Download the code.</w:t>
+      </w:r>
+      <w:r>
+        <w:t xml:space="preserve"> Open a terminal in the folder where you keep your projects (for example </w:t>
       </w:r>
       <w:r>
         <w:rPr>
           <w:rFonts w:ascii="Consolas" w:hAnsi="Consolas"/>
           <w:color w:val="D7263D"/>
         </w:rPr>
-        <w:t>heart-disease-azure-starter</w:t>
-      </w:r>
-      <w:r>
-        <w:t xml:space="preserve">), pick </w:t>
-      </w:r>
-      <w:r>
-        <w:rPr>
-          <w:b/>
-        </w:rPr>
-        <w:t>Public</w:t>
-      </w:r>
-      <w:r>
-        <w:t xml:space="preserve"> or </w:t>
-      </w:r>
-      <w:r>
-        <w:rPr>
-          <w:b/>
-        </w:rPr>
-        <w:t>Private</w:t>
-      </w:r>
-      <w:r>
-        <w:t xml:space="preserve">, and click </w:t>
-      </w:r>
-      <w:r>
-        <w:rPr>
-          <w:b/>
-        </w:rPr>
-        <w:t>Create repository</w:t>
-      </w:r>
-      <w:r>
-        <w:t>.</w:t>
-      </w:r>
-    </w:p>
-    <w:p>
-      <w:pPr>
-        <w:ind w:left="360" w:hanging="280"/>
-      </w:pPr>
-      <w:r>
-        <w:t xml:space="preserve">3. Clone </w:t>
-      </w:r>
-      <w:r>
-        <w:rPr>
-          <w:b/>
-        </w:rPr>
-        <w:t>your new repository</w:t>
-      </w:r>
-      <w:r>
-        <w:t xml:space="preserve"> (replace the placeholders):</w:t>
+        <w:t>cd ~/Projects</w:t>
+      </w:r>
+      <w:r>
+        <w:t xml:space="preserve">, or </w:t>
+      </w:r>
+      <w:r>
+        <w:rPr>
+          <w:rFonts w:ascii="Consolas" w:hAnsi="Consolas"/>
+          <w:color w:val="D7263D"/>
+        </w:rPr>
+        <w:t>cd Documents</w:t>
+      </w:r>
+      <w:r>
+        <w:t xml:space="preserve"> on Windows) and paste:</w:t>
       </w:r>
     </w:p>
     <w:p>
@@ -914,7 +855,7 @@
           <w:rFonts w:ascii="Consolas" w:hAnsi="Consolas"/>
           <w:sz w:val="18"/>
         </w:rPr>
-        <w:t>git clone https://github.com/&lt;your-github-username&gt;/&lt;your-repo-name&gt;.git</w:t>
+        <w:t>git clone https://github.com/Abhi1727/heart-disease-azure-starter.git</w:t>
       </w:r>
     </w:p>
     <w:p>
@@ -928,7 +869,7 @@
           <w:rFonts w:ascii="Consolas" w:hAnsi="Consolas"/>
           <w:sz w:val="18"/>
         </w:rPr>
-        <w:t>cd &lt;your-repo-name&gt;</w:t>
+        <w:t>cd heart-disease-azure-starter</w:t>
       </w:r>
     </w:p>
     <w:p>
@@ -938,24 +879,36 @@
     </w:p>
     <w:p>
       <w:r>
-        <w:rPr>
-          <w:b/>
-        </w:rPr>
-        <w:t>Option B — Fork</w:t>
+        <w:t>That is all you need to run and train the model locally (steps 5–8). The same commands work on macOS, Linux and Windows PowerShell.</w:t>
       </w:r>
     </w:p>
     <w:p>
       <w:r>
-        <w:t xml:space="preserve">Click </w:t>
-      </w:r>
-      <w:r>
         <w:rPr>
           <w:b/>
         </w:rPr>
-        <w:t>Fork → Create fork</w:t>
-      </w:r>
-      <w:r>
-        <w:t xml:space="preserve"> on the starter repository, then clone your fork as above. Forks start with GitHub Actions disabled; step 13 shows how to enable them.</w:t>
+        <w:t>2. Make it your own repository.</w:t>
+      </w:r>
+      <w:r>
+        <w:t xml:space="preserve"> To push your changes and deploy to </w:t>
+      </w:r>
+      <w:r>
+        <w:rPr>
+          <w:i/>
+        </w:rPr>
+        <w:t>your</w:t>
+      </w:r>
+      <w:r>
+        <w:t xml:space="preserve"> Azure account you need a copy on </w:t>
+      </w:r>
+      <w:r>
+        <w:rPr>
+          <w:i/>
+        </w:rPr>
+        <w:t>your</w:t>
+      </w:r>
+      <w:r>
+        <w:t xml:space="preserve"> GitHub account. Choose one option:</w:t>
       </w:r>
     </w:p>
     <w:p>
@@ -963,7 +916,32 @@
         <w:rPr>
           <w:b/>
         </w:rPr>
-        <w:t>Option C — Clone, then push to a new repository of your own</w:t>
+        <w:t>Option A — From the terminal (recommended, needs the GitHub CLI `gh`)</w:t>
+      </w:r>
+    </w:p>
+    <w:p>
+      <w:r>
+        <w:t xml:space="preserve">Run these inside the </w:t>
+      </w:r>
+      <w:r>
+        <w:rPr>
+          <w:rFonts w:ascii="Consolas" w:hAnsi="Consolas"/>
+          <w:color w:val="D7263D"/>
+        </w:rPr>
+        <w:t>heart-disease-azure-starter</w:t>
+      </w:r>
+      <w:r>
+        <w:t xml:space="preserve"> folder. Nothing needs editing: </w:t>
+      </w:r>
+      <w:r>
+        <w:rPr>
+          <w:rFonts w:ascii="Consolas" w:hAnsi="Consolas"/>
+          <w:color w:val="D7263D"/>
+        </w:rPr>
+        <w:t>gh</w:t>
+      </w:r>
+      <w:r>
+        <w:t xml:space="preserve"> uses the account you log in with.</w:t>
       </w:r>
     </w:p>
     <w:p>
@@ -977,7 +955,7 @@
           <w:rFonts w:ascii="Consolas" w:hAnsi="Consolas"/>
           <w:sz w:val="18"/>
         </w:rPr>
-        <w:t>git clone https://github.com/&lt;template-owner&gt;/heart-disease-azure-starter.git</w:t>
+        <w:t>gh auth login --scopes workflow</w:t>
       </w:r>
     </w:p>
     <w:p>
@@ -991,7 +969,7 @@
           <w:rFonts w:ascii="Consolas" w:hAnsi="Consolas"/>
           <w:sz w:val="18"/>
         </w:rPr>
-        <w:t>cd heart-disease-azure-starter</w:t>
+        <w:t>gh auth setup-git</w:t>
       </w:r>
     </w:p>
     <w:p>
@@ -1005,7 +983,7 @@
           <w:rFonts w:ascii="Consolas" w:hAnsi="Consolas"/>
           <w:sz w:val="18"/>
         </w:rPr>
-        <w:t># create an EMPTY repository on github.com first, then:</w:t>
+        <w:t>git remote rename origin upstream</w:t>
       </w:r>
     </w:p>
     <w:p>
@@ -1019,7 +997,202 @@
           <w:rFonts w:ascii="Consolas" w:hAnsi="Consolas"/>
           <w:sz w:val="18"/>
         </w:rPr>
-        <w:t>git remote set-url origin https://github.com/&lt;your-github-username&gt;/&lt;your-repo-name&gt;.git</w:t>
+        <w:t>gh repo create heart-disease-azure-starter --public --source . --remote origin --push</w:t>
+      </w:r>
+    </w:p>
+    <w:p>
+      <w:pPr>
+        <w:spacing w:after="40"/>
+      </w:pPr>
+    </w:p>
+    <w:p>
+      <w:pPr>
+        <w:pStyle w:val="ListBullet"/>
+      </w:pPr>
+      <w:r>
+        <w:rPr>
+          <w:rFonts w:ascii="Consolas" w:hAnsi="Consolas"/>
+          <w:color w:val="D7263D"/>
+        </w:rPr>
+        <w:t>gh auth login</w:t>
+      </w:r>
+      <w:r>
+        <w:t xml:space="preserve"> asks a few questions: choose </w:t>
+      </w:r>
+      <w:r>
+        <w:rPr>
+          <w:b/>
+        </w:rPr>
+        <w:t>GitHub.com → HTTPS → Login with a web browser</w:t>
+      </w:r>
+      <w:r>
+        <w:t>, and enter the code shown.</w:t>
+      </w:r>
+    </w:p>
+    <w:p>
+      <w:pPr>
+        <w:pStyle w:val="ListBullet"/>
+      </w:pPr>
+      <w:r>
+        <w:rPr>
+          <w:rFonts w:ascii="Consolas" w:hAnsi="Consolas"/>
+          <w:color w:val="D7263D"/>
+        </w:rPr>
+        <w:t>git remote rename origin upstream</w:t>
+      </w:r>
+      <w:r>
+        <w:t xml:space="preserve"> keeps a link to the original starter, so you can fetch future updates with </w:t>
+      </w:r>
+      <w:r>
+        <w:rPr>
+          <w:rFonts w:ascii="Consolas" w:hAnsi="Consolas"/>
+          <w:color w:val="D7263D"/>
+        </w:rPr>
+        <w:t>git pull upstream main</w:t>
+      </w:r>
+      <w:r>
+        <w:t>.</w:t>
+      </w:r>
+    </w:p>
+    <w:p>
+      <w:pPr>
+        <w:pStyle w:val="ListBullet"/>
+      </w:pPr>
+      <w:r>
+        <w:rPr>
+          <w:rFonts w:ascii="Consolas" w:hAnsi="Consolas"/>
+          <w:color w:val="D7263D"/>
+        </w:rPr>
+        <w:t>gh repo create</w:t>
+      </w:r>
+      <w:r>
+        <w:t xml:space="preserve"> creates </w:t>
+      </w:r>
+      <w:r>
+        <w:rPr>
+          <w:rFonts w:ascii="Consolas" w:hAnsi="Consolas"/>
+          <w:color w:val="D7263D"/>
+        </w:rPr>
+        <w:t>https://github.com/&lt;your-github-username&gt;/heart-disease-azure-starter</w:t>
+      </w:r>
+      <w:r>
+        <w:t xml:space="preserve"> and pushes the code to it. Use </w:t>
+      </w:r>
+      <w:r>
+        <w:rPr>
+          <w:rFonts w:ascii="Consolas" w:hAnsi="Consolas"/>
+          <w:color w:val="D7263D"/>
+        </w:rPr>
+        <w:t>--private</w:t>
+      </w:r>
+      <w:r>
+        <w:t xml:space="preserve"> instead of </w:t>
+      </w:r>
+      <w:r>
+        <w:rPr>
+          <w:rFonts w:ascii="Consolas" w:hAnsi="Consolas"/>
+          <w:color w:val="D7263D"/>
+        </w:rPr>
+        <w:t>--public</w:t>
+      </w:r>
+      <w:r>
+        <w:t xml:space="preserve"> if you prefer.</w:t>
+      </w:r>
+    </w:p>
+    <w:p>
+      <w:r>
+        <w:rPr>
+          <w:b/>
+        </w:rPr>
+        <w:t>Option B — From the website ("Use this template")</w:t>
+      </w:r>
+    </w:p>
+    <w:p>
+      <w:pPr>
+        <w:ind w:left="360" w:hanging="280"/>
+      </w:pPr>
+      <w:r>
+        <w:t xml:space="preserve">1. Open https://github.com/Abhi1727/heart-disease-azure-starter and click </w:t>
+      </w:r>
+      <w:r>
+        <w:rPr>
+          <w:b/>
+        </w:rPr>
+        <w:t>Use this template → Create a new repository</w:t>
+      </w:r>
+      <w:r>
+        <w:t>.</w:t>
+      </w:r>
+    </w:p>
+    <w:p>
+      <w:pPr>
+        <w:ind w:left="360" w:hanging="280"/>
+      </w:pPr>
+      <w:r>
+        <w:t xml:space="preserve">2. Keep the name </w:t>
+      </w:r>
+      <w:r>
+        <w:rPr>
+          <w:b/>
+        </w:rPr>
+        <w:t>`heart-disease-azure-starter`</w:t>
+      </w:r>
+      <w:r>
+        <w:t xml:space="preserve">, choose </w:t>
+      </w:r>
+      <w:r>
+        <w:rPr>
+          <w:b/>
+        </w:rPr>
+        <w:t>Public</w:t>
+      </w:r>
+      <w:r>
+        <w:t xml:space="preserve"> or </w:t>
+      </w:r>
+      <w:r>
+        <w:rPr>
+          <w:b/>
+        </w:rPr>
+        <w:t>Private</w:t>
+      </w:r>
+      <w:r>
+        <w:t xml:space="preserve">, and click </w:t>
+      </w:r>
+      <w:r>
+        <w:rPr>
+          <w:b/>
+        </w:rPr>
+        <w:t>Create repository</w:t>
+      </w:r>
+      <w:r>
+        <w:t>.</w:t>
+      </w:r>
+    </w:p>
+    <w:p>
+      <w:pPr>
+        <w:ind w:left="360" w:hanging="280"/>
+      </w:pPr>
+      <w:r>
+        <w:t xml:space="preserve">3. Replace the folder from step 1 with a clone of </w:t>
+      </w:r>
+      <w:r>
+        <w:rPr>
+          <w:b/>
+        </w:rPr>
+        <w:t>your</w:t>
+      </w:r>
+      <w:r>
+        <w:t xml:space="preserve"> copy. Change </w:t>
+      </w:r>
+      <w:r>
+        <w:rPr>
+          <w:rFonts w:ascii="Consolas" w:hAnsi="Consolas"/>
+          <w:color w:val="D7263D"/>
+        </w:rPr>
+        <w:t>&lt;your-github-username&gt;</w:t>
+      </w:r>
+      <w:r>
+        <w:t xml:space="preserve"> to your GitHub username before pressing Enter:</w:t>
       </w:r>
     </w:p>
     <w:p>
@@ -1033,34 +1206,7 @@
           <w:rFonts w:ascii="Consolas" w:hAnsi="Consolas"/>
           <w:sz w:val="18"/>
         </w:rPr>
-        <w:t>git push -u origin main</w:t>
-      </w:r>
-    </w:p>
-    <w:p>
-      <w:pPr>
-        <w:spacing w:after="40"/>
-      </w:pPr>
-    </w:p>
-    <w:p>
-      <w:r>
-        <w:t xml:space="preserve">From now on, </w:t>
-      </w:r>
-      <w:r>
-        <w:rPr>
-          <w:b/>
-        </w:rPr>
-        <w:t>all commands run inside the repository folder</w:t>
-      </w:r>
-      <w:r>
-        <w:t xml:space="preserve"> you just entered.</w:t>
-      </w:r>
-    </w:p>
-    <w:p>
-      <w:pPr>
-        <w:pStyle w:val="Heading1"/>
-      </w:pPr>
-      <w:r>
-        <w:t>4. Project structure</w:t>
+        <w:t>cd ..</w:t>
       </w:r>
     </w:p>
     <w:p>
@@ -1074,7 +1220,134 @@
           <w:rFonts w:ascii="Consolas" w:hAnsi="Consolas"/>
           <w:sz w:val="18"/>
         </w:rPr>
-        <w:t>&lt;your-repo-name&gt;/</w:t>
+        <w:t>rm -rf heart-disease-azure-starter      # Windows PowerShell: Remove-Item -Recurse -Force heart-disease-azure-starter</w:t>
+      </w:r>
+    </w:p>
+    <w:p>
+      <w:pPr>
+        <w:spacing w:after="0"/>
+        <w:ind w:left="240"/>
+        <w:shd w:val="clear" w:color="auto" w:fill="F1F5F9"/>
+      </w:pPr>
+      <w:r>
+        <w:rPr>
+          <w:rFonts w:ascii="Consolas" w:hAnsi="Consolas"/>
+          <w:sz w:val="18"/>
+        </w:rPr>
+        <w:t>git clone https://github.com/&lt;your-github-username&gt;/heart-disease-azure-starter.git</w:t>
+      </w:r>
+    </w:p>
+    <w:p>
+      <w:pPr>
+        <w:spacing w:after="0"/>
+        <w:ind w:left="240"/>
+        <w:shd w:val="clear" w:color="auto" w:fill="F1F5F9"/>
+      </w:pPr>
+      <w:r>
+        <w:rPr>
+          <w:rFonts w:ascii="Consolas" w:hAnsi="Consolas"/>
+          <w:sz w:val="18"/>
+        </w:rPr>
+        <w:t>cd heart-disease-azure-starter</w:t>
+      </w:r>
+    </w:p>
+    <w:p>
+      <w:pPr>
+        <w:spacing w:after="40"/>
+      </w:pPr>
+    </w:p>
+    <w:p>
+      <w:r>
+        <w:rPr>
+          <w:b/>
+        </w:rPr>
+        <w:t>Check it worked:</w:t>
+      </w:r>
+    </w:p>
+    <w:p>
+      <w:pPr>
+        <w:spacing w:after="0"/>
+        <w:ind w:left="240"/>
+        <w:shd w:val="clear" w:color="auto" w:fill="F1F5F9"/>
+      </w:pPr>
+      <w:r>
+        <w:rPr>
+          <w:rFonts w:ascii="Consolas" w:hAnsi="Consolas"/>
+          <w:sz w:val="18"/>
+        </w:rPr>
+        <w:t>git remote -v</w:t>
+      </w:r>
+    </w:p>
+    <w:p>
+      <w:pPr>
+        <w:spacing w:after="40"/>
+      </w:pPr>
+    </w:p>
+    <w:p>
+      <w:r>
+        <w:rPr>
+          <w:rFonts w:ascii="Consolas" w:hAnsi="Consolas"/>
+          <w:color w:val="D7263D"/>
+        </w:rPr>
+        <w:t>origin</w:t>
+      </w:r>
+      <w:r>
+        <w:t xml:space="preserve"> must point to </w:t>
+      </w:r>
+      <w:r>
+        <w:rPr>
+          <w:b/>
+        </w:rPr>
+        <w:t>your</w:t>
+      </w:r>
+      <w:r>
+        <w:t xml:space="preserve"> GitHub account. If it still shows </w:t>
+      </w:r>
+      <w:r>
+        <w:rPr>
+          <w:rFonts w:ascii="Consolas" w:hAnsi="Consolas"/>
+          <w:color w:val="D7263D"/>
+        </w:rPr>
+        <w:t>Abhi1727</w:t>
+      </w:r>
+      <w:r>
+        <w:t>, you are pushing to the original starter, which will be refused.</w:t>
+      </w:r>
+    </w:p>
+    <w:p>
+      <w:r>
+        <w:t xml:space="preserve">From now on, </w:t>
+      </w:r>
+      <w:r>
+        <w:rPr>
+          <w:b/>
+        </w:rPr>
+        <w:t>all commands run inside the `heart-disease-azure-starter` folder</w:t>
+      </w:r>
+      <w:r>
+        <w:t>.</w:t>
+      </w:r>
+    </w:p>
+    <w:p>
+      <w:pPr>
+        <w:pStyle w:val="Heading1"/>
+      </w:pPr>
+      <w:r>
+        <w:t>4. Project structure</w:t>
+      </w:r>
+    </w:p>
+    <w:p>
+      <w:pPr>
+        <w:spacing w:after="0"/>
+        <w:ind w:left="240"/>
+        <w:shd w:val="clear" w:color="auto" w:fill="F1F5F9"/>
+      </w:pPr>
+      <w:r>
+        <w:rPr>
+          <w:rFonts w:ascii="Consolas" w:hAnsi="Consolas"/>
+          <w:sz w:val="18"/>
+        </w:rPr>
+        <w:t>heart-disease-azure-starter/</w:t>
       </w:r>
     </w:p>
     <w:p>
@@ -2205,7 +2478,7 @@
           <w:rFonts w:ascii="Consolas" w:hAnsi="Consolas"/>
           <w:sz w:val="18"/>
         </w:rPr>
-        <w:t>cd &lt;your-repo-name&gt;</w:t>
+        <w:t>cd heart-disease-azure-starter</w:t>
       </w:r>
     </w:p>
     <w:p>
@@ -4565,7 +4838,7 @@
         <w:rPr>
           <w:b/>
         </w:rPr>
-        <w:t>3. Forks only: enable GitHub Actions</w:t>
+        <w:t>3. Check GitHub Actions is enabled</w:t>
       </w:r>
       <w:r>
         <w:t xml:space="preserve"> — open the </w:t>
@@ -4577,7 +4850,7 @@
         <w:t>Actions</w:t>
       </w:r>
       <w:r>
-        <w:t xml:space="preserve"> tab. Forks have workflows disabled by default; click </w:t>
+        <w:t xml:space="preserve"> tab of your repository. If it shows a button such as </w:t>
       </w:r>
       <w:r>
         <w:rPr>
@@ -4586,7 +4859,7 @@
         <w:t>"I understand my workflows, go ahead and enable them"</w:t>
       </w:r>
       <w:r>
-        <w:t>. Repositories created from the template already have them enabled.</w:t>
+        <w:t>, click it.</w:t>
       </w:r>
     </w:p>
     <w:p>
@@ -4753,7 +5026,7 @@
           <w:rFonts w:ascii="Consolas" w:hAnsi="Consolas"/>
           <w:sz w:val="18"/>
         </w:rPr>
-        <w:t>cd &lt;your-repo-name&gt;</w:t>
+        <w:t>cd heart-disease-azure-starter</w:t>
       </w:r>
     </w:p>
     <w:p>

</xml_diff>